<commit_message>
Word con formato de informe formal y mejor extraccion de lo que dispone cada norma
- Encabezado institucional, pie con numeracion, ficha tecnica y Cuadro 1 numerado por tema
- Fichas uniformes por norma; recuadro de alerta para la ATU
- Articulo resolutivo tomado despues de "SE RESUELVE/ACORDO"; montos sin duplicados
- Words del panel (01/09-26/10) regenerados con el nuevo formato

Co-Authored-By: Claude Opus 5.5 <noreply@anthropic.com>
</commit_message>
<xml_diff>
--- a/docs/resumenes/Normas_ElPeruano_20260901.docx
+++ b/docs/resumenes/Normas_ElPeruano_20260901.docx
@@ -4,69 +4,148 @@
   <w:body>
     <w:p>
       <w:pPr>
-        <w:pStyle w:val="Title"/>
+        <w:spacing w:before="0" w:after="40" w:line="276" w:lineRule="auto"/>
         <w:jc w:val="center"/>
       </w:pPr>
       <w:r>
-        <w:t>Resumen de Normas Legales – Diario Oficial El Peruano</w:t>
+        <w:rPr>
+          <w:rFonts w:ascii="Arial" w:hAnsi="Arial" w:eastAsia="Arial"/>
+          <w:b/>
+          <w:i w:val="0"/>
+          <w:color w:val="0A2F5C"/>
+          <w:sz w:val="36"/>
+        </w:rPr>
+        <w:t>RESUMEN DE NORMAS LEGALES</w:t>
       </w:r>
     </w:p>
     <w:p>
       <w:pPr>
+        <w:spacing w:before="0" w:after="40" w:line="276" w:lineRule="auto"/>
         <w:jc w:val="center"/>
       </w:pPr>
       <w:r>
         <w:rPr>
-          <w:b/>
+          <w:rFonts w:ascii="Arial" w:hAnsi="Arial" w:eastAsia="Arial"/>
+          <w:b w:val="0"/>
+          <w:i w:val="0"/>
+          <w:color w:val="5B6880"/>
+          <w:sz w:val="21"/>
         </w:rPr>
-        <w:t>Periodo revisado: 01/09/2026</w:t>
-        <w:br/>
-      </w:r>
-      <w:r>
-        <w:t>Generado: 26/10/2026 10:15  ·  Fuente: diariooficial.elperuano.pe</w:t>
+        <w:t>Diario Oficial El Peruano · Martes 1 de septiembre de 2026</w:t>
       </w:r>
     </w:p>
     <w:p>
       <w:pPr>
-        <w:pStyle w:val="Heading1"/>
+        <w:spacing w:before="0" w:after="200" w:line="276" w:lineRule="auto"/>
+        <w:pBdr>
+          <w:bottom w:val="single" w:sz="18" w:space="1" w:color="0A2F5C"/>
+        </w:pBdr>
       </w:pPr>
-      <w:r>
-        <w:t>1. Resumen ejecutivo</w:t>
-      </w:r>
-    </w:p>
-    <w:p>
-      <w:r>
-        <w:t>Se revisaron 109 normas publicadas en el periodo. 2 resultan de interés para la ATU por tratar sobre la entidad, la normatividad presupuestal o las inversiones.</w:t>
-      </w:r>
     </w:p>
     <w:tbl>
       <w:tblPr>
-        <w:tblStyle w:val="LightGrid-Accent1"/>
         <w:tblW w:type="auto" w:w="0"/>
         <w:tblLook w:firstColumn="1" w:firstRow="1" w:lastColumn="0" w:lastRow="0" w:noHBand="0" w:noVBand="1" w:val="04A0"/>
+        <w:tblBorders>
+          <w:top w:val="single" w:sz="4" w:space="0" w:color="C9D2DF"/>
+          <w:left w:val="single" w:sz="4" w:space="0" w:color="C9D2DF"/>
+          <w:bottom w:val="single" w:sz="4" w:space="0" w:color="C9D2DF"/>
+          <w:right w:val="single" w:sz="4" w:space="0" w:color="C9D2DF"/>
+          <w:insideH w:val="single" w:sz="4" w:space="0" w:color="C9D2DF"/>
+          <w:insideV w:val="single" w:sz="4" w:space="0" w:color="C9D2DF"/>
+        </w:tblBorders>
+        <w:tblLayout w:type="fixed"/>
+        <w:tblCellMar>
+          <w:top w:w="50" w:type="dxa"/>
+          <w:bottom w:w="50" w:type="dxa"/>
+          <w:left w:w="100" w:type="dxa"/>
+          <w:right w:w="100" w:type="dxa"/>
+        </w:tblCellMar>
       </w:tblPr>
       <w:tblGrid>
-        <w:gridCol w:w="4986"/>
-        <w:gridCol w:w="4986"/>
+        <w:gridCol w:w="2353"/>
+        <w:gridCol w:w="2353"/>
+        <w:gridCol w:w="2353"/>
+        <w:gridCol w:w="2353"/>
       </w:tblGrid>
       <w:tr>
         <w:tc>
           <w:tcPr>
-            <w:tcW w:type="dxa" w:w="4986"/>
+            <w:tcW w:type="dxa" w:w="2041"/>
+            <w:shd w:val="clear" w:color="auto" w:fill="F2F5FA"/>
           </w:tcPr>
           <w:p>
+            <w:pPr>
+              <w:spacing w:before="20" w:after="20" w:line="264" w:lineRule="auto"/>
+            </w:pPr>
             <w:r>
-              <w:t>Tema</w:t>
+              <w:rPr>
+                <w:rFonts w:ascii="Arial" w:hAnsi="Arial" w:eastAsia="Arial"/>
+                <w:b/>
+                <w:i w:val="0"/>
+                <w:color w:val="0A2F5C"/>
+                <w:sz w:val="17"/>
+              </w:rPr>
+              <w:t>Periodo revisado</w:t>
             </w:r>
           </w:p>
         </w:tc>
         <w:tc>
           <w:tcPr>
-            <w:tcW w:type="dxa" w:w="4986"/>
+            <w:tcW w:type="dxa" w:w="2665"/>
           </w:tcPr>
           <w:p>
+            <w:pPr>
+              <w:spacing w:before="20" w:after="20" w:line="264" w:lineRule="auto"/>
+            </w:pPr>
             <w:r>
-              <w:t>N.° de normas</w:t>
+              <w:rPr>
+                <w:rFonts w:ascii="Arial" w:hAnsi="Arial" w:eastAsia="Arial"/>
+                <w:b w:val="0"/>
+                <w:i w:val="0"/>
+                <w:sz w:val="19"/>
+              </w:rPr>
+              <w:t>01/09/2026</w:t>
+            </w:r>
+          </w:p>
+        </w:tc>
+        <w:tc>
+          <w:tcPr>
+            <w:tcW w:type="dxa" w:w="2041"/>
+            <w:shd w:val="clear" w:color="auto" w:fill="F2F5FA"/>
+          </w:tcPr>
+          <w:p>
+            <w:pPr>
+              <w:spacing w:before="20" w:after="20" w:line="264" w:lineRule="auto"/>
+            </w:pPr>
+            <w:r>
+              <w:rPr>
+                <w:rFonts w:ascii="Arial" w:hAnsi="Arial" w:eastAsia="Arial"/>
+                <w:b/>
+                <w:i w:val="0"/>
+                <w:color w:val="0A2F5C"/>
+                <w:sz w:val="17"/>
+              </w:rPr>
+              <w:t>Fecha de elaboración</w:t>
+            </w:r>
+          </w:p>
+        </w:tc>
+        <w:tc>
+          <w:tcPr>
+            <w:tcW w:type="dxa" w:w="2665"/>
+          </w:tcPr>
+          <w:p>
+            <w:pPr>
+              <w:spacing w:before="20" w:after="20" w:line="264" w:lineRule="auto"/>
+            </w:pPr>
+            <w:r>
+              <w:rPr>
+                <w:rFonts w:ascii="Arial" w:hAnsi="Arial" w:eastAsia="Arial"/>
+                <w:b w:val="0"/>
+                <w:i w:val="0"/>
+                <w:sz w:val="19"/>
+              </w:rPr>
+              <w:t>26/10/2026 16:55</w:t>
             </w:r>
           </w:p>
         </w:tc>
@@ -74,65 +153,82 @@
       <w:tr>
         <w:tc>
           <w:tcPr>
-            <w:tcW w:type="dxa" w:w="4986"/>
+            <w:tcW w:type="dxa" w:w="2041"/>
+            <w:shd w:val="clear" w:color="auto" w:fill="F2F5FA"/>
           </w:tcPr>
           <w:p>
+            <w:pPr>
+              <w:spacing w:before="20" w:after="20" w:line="264" w:lineRule="auto"/>
+            </w:pPr>
             <w:r>
-              <w:t>ATU y transporte urbano</w:t>
+              <w:rPr>
+                <w:rFonts w:ascii="Arial" w:hAnsi="Arial" w:eastAsia="Arial"/>
+                <w:b/>
+                <w:i w:val="0"/>
+                <w:color w:val="0A2F5C"/>
+                <w:sz w:val="17"/>
+              </w:rPr>
+              <w:t>Normas publicadas</w:t>
             </w:r>
           </w:p>
         </w:tc>
         <w:tc>
           <w:tcPr>
-            <w:tcW w:type="dxa" w:w="4986"/>
+            <w:tcW w:type="dxa" w:w="2665"/>
           </w:tcPr>
           <w:p>
+            <w:pPr>
+              <w:spacing w:before="20" w:after="20" w:line="264" w:lineRule="auto"/>
+            </w:pPr>
             <w:r>
-              <w:t>0</w:t>
-            </w:r>
-          </w:p>
-        </w:tc>
-      </w:tr>
-      <w:tr>
-        <w:tc>
-          <w:tcPr>
-            <w:tcW w:type="dxa" w:w="4986"/>
-          </w:tcPr>
-          <w:p>
-            <w:r>
-              <w:t>Normatividad presupuestal</w:t>
+              <w:rPr>
+                <w:rFonts w:ascii="Arial" w:hAnsi="Arial" w:eastAsia="Arial"/>
+                <w:b w:val="0"/>
+                <w:i w:val="0"/>
+                <w:sz w:val="19"/>
+              </w:rPr>
+              <w:t>109</w:t>
             </w:r>
           </w:p>
         </w:tc>
         <w:tc>
           <w:tcPr>
-            <w:tcW w:type="dxa" w:w="4986"/>
+            <w:tcW w:type="dxa" w:w="2041"/>
+            <w:shd w:val="clear" w:color="auto" w:fill="F2F5FA"/>
           </w:tcPr>
           <w:p>
+            <w:pPr>
+              <w:spacing w:before="20" w:after="20" w:line="264" w:lineRule="auto"/>
+            </w:pPr>
             <w:r>
-              <w:t>2</w:t>
-            </w:r>
-          </w:p>
-        </w:tc>
-      </w:tr>
-      <w:tr>
-        <w:tc>
-          <w:tcPr>
-            <w:tcW w:type="dxa" w:w="4986"/>
-          </w:tcPr>
-          <w:p>
-            <w:r>
-              <w:t>Inversiones</w:t>
+              <w:rPr>
+                <w:rFonts w:ascii="Arial" w:hAnsi="Arial" w:eastAsia="Arial"/>
+                <w:b/>
+                <w:i w:val="0"/>
+                <w:color w:val="0A2F5C"/>
+                <w:sz w:val="17"/>
+              </w:rPr>
+              <w:t>Normas de interés</w:t>
             </w:r>
           </w:p>
         </w:tc>
         <w:tc>
           <w:tcPr>
-            <w:tcW w:type="dxa" w:w="4986"/>
+            <w:tcW w:type="dxa" w:w="2665"/>
           </w:tcPr>
           <w:p>
+            <w:pPr>
+              <w:spacing w:before="20" w:after="20" w:line="264" w:lineRule="auto"/>
+            </w:pPr>
             <w:r>
-              <w:t>0</w:t>
+              <w:rPr>
+                <w:rFonts w:ascii="Arial" w:hAnsi="Arial" w:eastAsia="Arial"/>
+                <w:b/>
+                <w:i w:val="0"/>
+                <w:color w:val="0A2F5C"/>
+                <w:sz w:val="19"/>
+              </w:rPr>
+              <w:t>2</w:t>
             </w:r>
           </w:p>
         </w:tc>
@@ -140,112 +236,261 @@
     </w:tbl>
     <w:p>
       <w:pPr>
-        <w:pStyle w:val="Heading1"/>
+        <w:spacing w:before="280" w:after="120" w:line="276" w:lineRule="auto"/>
+        <w:keepNext/>
+        <w:pBdr>
+          <w:bottom w:val="single" w:sz="6" w:space="2" w:color="C9D2DF"/>
+        </w:pBdr>
       </w:pPr>
       <w:r>
-        <w:t>2. Normatividad presupuestal (2)</w:t>
+        <w:rPr>
+          <w:rFonts w:ascii="Arial" w:hAnsi="Arial" w:eastAsia="Arial"/>
+          <w:b/>
+          <w:i w:val="0"/>
+          <w:color w:val="0A2F5C"/>
+          <w:sz w:val="22"/>
+        </w:rPr>
+        <w:t>1. RESUMEN EJECUTIVO</w:t>
+      </w:r>
+    </w:p>
+    <w:p>
+      <w:pPr>
+        <w:spacing w:before="0" w:after="160" w:line="276" w:lineRule="auto"/>
+        <w:jc w:val="both"/>
+      </w:pPr>
+      <w:r>
+        <w:rPr>
+          <w:rFonts w:ascii="Arial" w:hAnsi="Arial" w:eastAsia="Arial"/>
+          <w:b w:val="0"/>
+          <w:i w:val="0"/>
+          <w:sz w:val="20"/>
+        </w:rPr>
+        <w:t>De las 109 normas publicadas en el periodo, 2 resultan de interés institucional: 2 de normatividad presupuestal. No se identificaron normas que involucren a la ATU. El Cuadro 1 presenta la relación completa y la sección 2, el detalle de cada norma.</w:t>
+      </w:r>
+    </w:p>
+    <w:p>
+      <w:pPr>
+        <w:keepNext/>
+        <w:spacing w:before="80" w:after="60" w:line="276" w:lineRule="auto"/>
+      </w:pPr>
+      <w:r>
+        <w:rPr>
+          <w:rFonts w:ascii="Arial" w:hAnsi="Arial" w:eastAsia="Arial"/>
+          <w:b/>
+          <w:i w:val="0"/>
+          <w:color w:val="0A2F5C"/>
+          <w:sz w:val="18"/>
+        </w:rPr>
+        <w:t>Cuadro 1. Normas de interés identificadas</w:t>
       </w:r>
     </w:p>
     <w:tbl>
       <w:tblPr>
-        <w:tblStyle w:val="TableGrid"/>
         <w:tblW w:type="auto" w:w="0"/>
         <w:tblLook w:firstColumn="1" w:firstRow="1" w:lastColumn="0" w:lastRow="0" w:noHBand="0" w:noVBand="1" w:val="04A0"/>
+        <w:tblBorders>
+          <w:top w:val="single" w:sz="4" w:space="0" w:color="C9D2DF"/>
+          <w:left w:val="single" w:sz="4" w:space="0" w:color="C9D2DF"/>
+          <w:bottom w:val="single" w:sz="4" w:space="0" w:color="C9D2DF"/>
+          <w:right w:val="single" w:sz="4" w:space="0" w:color="C9D2DF"/>
+          <w:insideH w:val="single" w:sz="4" w:space="0" w:color="C9D2DF"/>
+          <w:insideV w:val="single" w:sz="4" w:space="0" w:color="C9D2DF"/>
+        </w:tblBorders>
+        <w:tblLayout w:type="fixed"/>
+        <w:tblCellMar>
+          <w:top w:w="50" w:type="dxa"/>
+          <w:bottom w:w="50" w:type="dxa"/>
+          <w:left w:w="100" w:type="dxa"/>
+          <w:right w:w="100" w:type="dxa"/>
+        </w:tblCellMar>
       </w:tblPr>
       <w:tblGrid>
-        <w:gridCol w:w="2493"/>
-        <w:gridCol w:w="2493"/>
-        <w:gridCol w:w="2493"/>
-        <w:gridCol w:w="2493"/>
+        <w:gridCol w:w="2353"/>
+        <w:gridCol w:w="2353"/>
+        <w:gridCol w:w="2353"/>
+        <w:gridCol w:w="2353"/>
       </w:tblGrid>
       <w:tr>
+        <w:trPr>
+          <w:cantSplit/>
+          <w:tblHeader/>
+        </w:trPr>
         <w:tc>
           <w:tcPr>
-            <w:tcW w:type="dxa" w:w="1247"/>
-            <w:shd w:val="clear" w:color="auto" w:fill="1F4E79"/>
+            <w:tcW w:type="dxa" w:w="567"/>
+            <w:shd w:val="clear" w:color="auto" w:fill="0A2F5C"/>
           </w:tcPr>
           <w:p>
+            <w:pPr>
+              <w:spacing w:before="20" w:after="20" w:line="264" w:lineRule="auto"/>
+              <w:jc w:val="center"/>
+            </w:pPr>
             <w:r>
               <w:rPr>
+                <w:rFonts w:ascii="Arial" w:hAnsi="Arial" w:eastAsia="Arial"/>
                 <w:b/>
+                <w:i w:val="0"/>
                 <w:color w:val="FFFFFF"/>
-                <w:sz w:val="18"/>
+                <w:sz w:val="17"/>
               </w:rPr>
-              <w:t>Fecha</w:t>
+              <w:t>N.°</w:t>
             </w:r>
           </w:p>
         </w:tc>
         <w:tc>
           <w:tcPr>
-            <w:tcW w:type="dxa" w:w="1984"/>
-            <w:shd w:val="clear" w:color="auto" w:fill="1F4E79"/>
+            <w:tcW w:type="dxa" w:w="2835"/>
+            <w:shd w:val="clear" w:color="auto" w:fill="0A2F5C"/>
           </w:tcPr>
           <w:p>
+            <w:pPr>
+              <w:spacing w:before="20" w:after="20" w:line="264" w:lineRule="auto"/>
+              <w:jc w:val="center"/>
+            </w:pPr>
             <w:r>
               <w:rPr>
+                <w:rFonts w:ascii="Arial" w:hAnsi="Arial" w:eastAsia="Arial"/>
                 <w:b/>
+                <w:i w:val="0"/>
                 <w:color w:val="FFFFFF"/>
-                <w:sz w:val="18"/>
+                <w:sz w:val="17"/>
               </w:rPr>
-              <w:t>Entidad</w:t>
+              <w:t>Norma y entidad emisora</w:t>
             </w:r>
           </w:p>
         </w:tc>
         <w:tc>
           <w:tcPr>
-            <w:tcW w:type="dxa" w:w="2268"/>
-            <w:shd w:val="clear" w:color="auto" w:fill="1F4E79"/>
+            <w:tcW w:type="dxa" w:w="4762"/>
+            <w:shd w:val="clear" w:color="auto" w:fill="0A2F5C"/>
           </w:tcPr>
           <w:p>
+            <w:pPr>
+              <w:spacing w:before="20" w:after="20" w:line="264" w:lineRule="auto"/>
+              <w:jc w:val="center"/>
+            </w:pPr>
             <w:r>
               <w:rPr>
+                <w:rFonts w:ascii="Arial" w:hAnsi="Arial" w:eastAsia="Arial"/>
                 <w:b/>
+                <w:i w:val="0"/>
                 <w:color w:val="FFFFFF"/>
-                <w:sz w:val="18"/>
+                <w:sz w:val="17"/>
               </w:rPr>
-              <w:t>Norma</w:t>
+              <w:t>Sumilla</w:t>
             </w:r>
           </w:p>
         </w:tc>
         <w:tc>
           <w:tcPr>
-            <w:tcW w:type="dxa" w:w="4139"/>
-            <w:shd w:val="clear" w:color="auto" w:fill="1F4E79"/>
+            <w:tcW w:type="dxa" w:w="1247"/>
+            <w:shd w:val="clear" w:color="auto" w:fill="0A2F5C"/>
           </w:tcPr>
           <w:p>
+            <w:pPr>
+              <w:spacing w:before="20" w:after="20" w:line="264" w:lineRule="auto"/>
+              <w:jc w:val="center"/>
+            </w:pPr>
             <w:r>
               <w:rPr>
+                <w:rFonts w:ascii="Arial" w:hAnsi="Arial" w:eastAsia="Arial"/>
                 <w:b/>
+                <w:i w:val="0"/>
                 <w:color w:val="FFFFFF"/>
-                <w:sz w:val="18"/>
+                <w:sz w:val="17"/>
               </w:rPr>
-              <w:t>Sumilla</w:t>
+              <w:t>Publicación</w:t>
             </w:r>
           </w:p>
         </w:tc>
       </w:tr>
       <w:tr>
+        <w:trPr>
+          <w:cantSplit/>
+        </w:trPr>
         <w:tc>
           <w:tcPr>
             <w:tcW w:type="dxa" w:w="1247"/>
+            <w:gridSpan w:val="4"/>
+            <w:shd w:val="clear" w:color="auto" w:fill="F2F5FA"/>
+            <w:tcBorders>
+              <w:left w:val="single" w:sz="30" w:space="0" w:color="EB6834"/>
+            </w:tcBorders>
           </w:tcPr>
           <w:p>
+            <w:pPr>
+              <w:spacing w:before="20" w:after="20" w:line="264" w:lineRule="auto"/>
+            </w:pPr>
             <w:r>
               <w:rPr>
+                <w:rFonts w:ascii="Arial" w:hAnsi="Arial" w:eastAsia="Arial"/>
+                <w:b/>
+                <w:i w:val="0"/>
+                <w:color w:val="0A2F5C"/>
+                <w:sz w:val="17"/>
+              </w:rPr>
+              <w:t>NORMATIVIDAD PRESUPUESTAL  (2)</w:t>
+            </w:r>
+          </w:p>
+        </w:tc>
+      </w:tr>
+      <w:tr>
+        <w:trPr>
+          <w:cantSplit/>
+        </w:trPr>
+        <w:tc>
+          <w:tcPr>
+            <w:tcW w:type="dxa" w:w="567"/>
+          </w:tcPr>
+          <w:p>
+            <w:pPr>
+              <w:spacing w:before="20" w:after="20" w:line="264" w:lineRule="auto"/>
+              <w:jc w:val="center"/>
+            </w:pPr>
+            <w:r>
+              <w:rPr>
+                <w:rFonts w:ascii="Arial" w:hAnsi="Arial" w:eastAsia="Arial"/>
+                <w:b/>
+                <w:i w:val="0"/>
+                <w:color w:val="0A2F5C"/>
                 <w:sz w:val="18"/>
               </w:rPr>
-              <w:t>01/09/2026</w:t>
+              <w:t>1</w:t>
             </w:r>
           </w:p>
         </w:tc>
         <w:tc>
           <w:tcPr>
-            <w:tcW w:type="dxa" w:w="1984"/>
+            <w:tcW w:type="dxa" w:w="2835"/>
           </w:tcPr>
           <w:p>
+            <w:pPr>
+              <w:spacing w:before="20" w:after="20" w:line="264" w:lineRule="auto"/>
+            </w:pPr>
+            <w:hyperlink r:id="rId11">
+              <w:r>
+                <w:rPr>
+                  <w:rFonts w:ascii="Arial" w:hAnsi="Arial" w:eastAsia="Arial" w:cs="Arial"/>
+                  <w:b/>
+                  <w:color w:val="0B5CAD"/>
+                  <w:sz w:val="17"/>
+                  <w:u w:val="single"/>
+                </w:rPr>
+                <w:t xml:space="preserve">DECRETO SUPREMO  N° 171-2026-EF</w:t>
+              </w:r>
+            </w:hyperlink>
+          </w:p>
+          <w:p>
+            <w:pPr>
+              <w:spacing w:before="0" w:after="20" w:line="252" w:lineRule="auto"/>
+            </w:pPr>
             <w:r>
               <w:rPr>
-                <w:sz w:val="18"/>
+                <w:rFonts w:ascii="Arial" w:hAnsi="Arial" w:eastAsia="Arial"/>
+                <w:b w:val="0"/>
+                <w:i w:val="0"/>
+                <w:color w:val="5B6880"/>
+                <w:sz w:val="15"/>
               </w:rPr>
               <w:t>ECONOMÍA Y FINANZAS</w:t>
             </w:r>
@@ -253,32 +498,409 @@
         </w:tc>
         <w:tc>
           <w:tcPr>
-            <w:tcW w:type="dxa" w:w="2268"/>
+            <w:tcW w:type="dxa" w:w="4762"/>
           </w:tcPr>
           <w:p>
+            <w:pPr>
+              <w:spacing w:before="20" w:after="20" w:line="264" w:lineRule="auto"/>
+            </w:pPr>
             <w:r>
               <w:rPr>
-                <w:sz w:val="18"/>
+                <w:rFonts w:ascii="Arial" w:hAnsi="Arial" w:eastAsia="Arial"/>
+                <w:b w:val="0"/>
+                <w:i w:val="0"/>
+                <w:sz w:val="17"/>
               </w:rPr>
+              <w:t>Decreto Supremo que autoriza Transferencia de Partidas en el Presupuesto del Sector Público para el Año Fiscal 2026 a favor del Ministerio del Interior</w:t>
             </w:r>
-            <w:hyperlink r:id="rId9">
-              <w:r>
-                <w:rPr>
-                  <w:color w:val="0563C1"/>
-                  <w:u w:val="single"/>
-                </w:rPr>
-                <w:t>DECRETO SUPREMO  N° 171-2026-EF</w:t>
-              </w:r>
-            </w:hyperlink>
           </w:p>
         </w:tc>
         <w:tc>
           <w:tcPr>
-            <w:tcW w:type="dxa" w:w="4139"/>
+            <w:tcW w:type="dxa" w:w="1247"/>
           </w:tcPr>
           <w:p>
+            <w:pPr>
+              <w:spacing w:before="20" w:after="20" w:line="264" w:lineRule="auto"/>
+              <w:jc w:val="center"/>
+            </w:pPr>
             <w:r>
               <w:rPr>
+                <w:rFonts w:ascii="Arial" w:hAnsi="Arial" w:eastAsia="Arial"/>
+                <w:b w:val="0"/>
+                <w:i w:val="0"/>
+                <w:sz w:val="17"/>
+              </w:rPr>
+              <w:t>01/09/2026</w:t>
+            </w:r>
+          </w:p>
+        </w:tc>
+      </w:tr>
+      <w:tr>
+        <w:trPr>
+          <w:cantSplit/>
+        </w:trPr>
+        <w:tc>
+          <w:tcPr>
+            <w:tcW w:type="dxa" w:w="567"/>
+          </w:tcPr>
+          <w:p>
+            <w:pPr>
+              <w:spacing w:before="20" w:after="20" w:line="264" w:lineRule="auto"/>
+              <w:jc w:val="center"/>
+            </w:pPr>
+            <w:r>
+              <w:rPr>
+                <w:rFonts w:ascii="Arial" w:hAnsi="Arial" w:eastAsia="Arial"/>
+                <w:b/>
+                <w:i w:val="0"/>
+                <w:color w:val="0A2F5C"/>
+                <w:sz w:val="18"/>
+              </w:rPr>
+              <w:t>2</w:t>
+            </w:r>
+          </w:p>
+        </w:tc>
+        <w:tc>
+          <w:tcPr>
+            <w:tcW w:type="dxa" w:w="2835"/>
+          </w:tcPr>
+          <w:p>
+            <w:pPr>
+              <w:spacing w:before="20" w:after="20" w:line="264" w:lineRule="auto"/>
+            </w:pPr>
+            <w:hyperlink r:id="rId12">
+              <w:r>
+                <w:rPr>
+                  <w:rFonts w:ascii="Arial" w:hAnsi="Arial" w:eastAsia="Arial" w:cs="Arial"/>
+                  <w:b/>
+                  <w:color w:val="0B5CAD"/>
+                  <w:sz w:val="17"/>
+                  <w:u w:val="single"/>
+                </w:rPr>
+                <w:t xml:space="preserve">DECRETO SUPREMO  N° 011-2026-TR</w:t>
+              </w:r>
+            </w:hyperlink>
+          </w:p>
+          <w:p>
+            <w:pPr>
+              <w:spacing w:before="0" w:after="20" w:line="252" w:lineRule="auto"/>
+            </w:pPr>
+            <w:r>
+              <w:rPr>
+                <w:rFonts w:ascii="Arial" w:hAnsi="Arial" w:eastAsia="Arial"/>
+                <w:b w:val="0"/>
+                <w:i w:val="0"/>
+                <w:color w:val="5B6880"/>
+                <w:sz w:val="15"/>
+              </w:rPr>
+              <w:t>TRABAJO Y PROMOCIÓN DEL EMPLEO</w:t>
+            </w:r>
+          </w:p>
+        </w:tc>
+        <w:tc>
+          <w:tcPr>
+            <w:tcW w:type="dxa" w:w="4762"/>
+          </w:tcPr>
+          <w:p>
+            <w:pPr>
+              <w:spacing w:before="20" w:after="20" w:line="264" w:lineRule="auto"/>
+            </w:pPr>
+            <w:r>
+              <w:rPr>
+                <w:rFonts w:ascii="Arial" w:hAnsi="Arial" w:eastAsia="Arial"/>
+                <w:b w:val="0"/>
+                <w:i w:val="0"/>
+                <w:sz w:val="17"/>
+              </w:rPr>
+              <w:t>Decreto Supremo que aprueba la Transferencia Financiera del Aporte Total del Programa Llamkasun Perú a favor de organismos ejecutores</w:t>
+            </w:r>
+          </w:p>
+        </w:tc>
+        <w:tc>
+          <w:tcPr>
+            <w:tcW w:type="dxa" w:w="1247"/>
+          </w:tcPr>
+          <w:p>
+            <w:pPr>
+              <w:spacing w:before="20" w:after="20" w:line="264" w:lineRule="auto"/>
+              <w:jc w:val="center"/>
+            </w:pPr>
+            <w:r>
+              <w:rPr>
+                <w:rFonts w:ascii="Arial" w:hAnsi="Arial" w:eastAsia="Arial"/>
+                <w:b w:val="0"/>
+                <w:i w:val="0"/>
+                <w:sz w:val="17"/>
+              </w:rPr>
+              <w:t>01/09/2026</w:t>
+            </w:r>
+          </w:p>
+        </w:tc>
+      </w:tr>
+    </w:tbl>
+    <w:p>
+      <w:pPr>
+        <w:spacing w:before="280" w:after="120" w:line="276" w:lineRule="auto"/>
+        <w:keepNext/>
+        <w:pBdr>
+          <w:bottom w:val="single" w:sz="6" w:space="2" w:color="C9D2DF"/>
+        </w:pBdr>
+      </w:pPr>
+      <w:r>
+        <w:rPr>
+          <w:rFonts w:ascii="Arial" w:hAnsi="Arial" w:eastAsia="Arial"/>
+          <w:b/>
+          <w:i w:val="0"/>
+          <w:color w:val="0A2F5C"/>
+          <w:sz w:val="22"/>
+        </w:rPr>
+        <w:t>2. DETALLE DE LAS NORMAS</w:t>
+      </w:r>
+    </w:p>
+    <w:p>
+      <w:pPr>
+        <w:keepNext/>
+        <w:spacing w:before="160" w:after="80" w:line="276" w:lineRule="auto"/>
+      </w:pPr>
+      <w:r>
+        <w:rPr>
+          <w:rFonts w:ascii="Arial" w:hAnsi="Arial" w:eastAsia="Arial"/>
+          <w:b/>
+          <w:i w:val="0"/>
+          <w:color w:val="0B5CAD"/>
+          <w:sz w:val="21"/>
+        </w:rPr>
+        <w:t>2.1  Normatividad presupuestal</w:t>
+      </w:r>
+    </w:p>
+    <w:tbl>
+      <w:tblPr>
+        <w:tblW w:type="auto" w:w="0"/>
+        <w:tblLook w:firstColumn="1" w:firstRow="1" w:lastColumn="0" w:lastRow="0" w:noHBand="0" w:noVBand="1" w:val="04A0"/>
+        <w:tblBorders>
+          <w:top w:val="single" w:sz="4" w:space="0" w:color="C9D2DF"/>
+          <w:left w:val="single" w:sz="4" w:space="0" w:color="C9D2DF"/>
+          <w:bottom w:val="single" w:sz="4" w:space="0" w:color="C9D2DF"/>
+          <w:right w:val="single" w:sz="4" w:space="0" w:color="C9D2DF"/>
+          <w:insideH w:val="single" w:sz="4" w:space="0" w:color="C9D2DF"/>
+          <w:insideV w:val="single" w:sz="4" w:space="0" w:color="C9D2DF"/>
+        </w:tblBorders>
+        <w:tblLayout w:type="fixed"/>
+        <w:tblCellMar>
+          <w:top w:w="50" w:type="dxa"/>
+          <w:bottom w:w="50" w:type="dxa"/>
+          <w:left w:w="100" w:type="dxa"/>
+          <w:right w:w="100" w:type="dxa"/>
+        </w:tblCellMar>
+      </w:tblPr>
+      <w:tblGrid>
+        <w:gridCol w:w="4706"/>
+        <w:gridCol w:w="4706"/>
+      </w:tblGrid>
+      <w:tr>
+        <w:trPr>
+          <w:cantSplit/>
+        </w:trPr>
+        <w:tc>
+          <w:tcPr>
+            <w:tcW w:type="dxa" w:w="7370"/>
+            <w:gridSpan w:val="2"/>
+            <w:shd w:val="clear" w:color="auto" w:fill="E8F0FA"/>
+            <w:tcBorders>
+              <w:left w:val="single" w:sz="30" w:space="0" w:color="EB6834"/>
+            </w:tcBorders>
+          </w:tcPr>
+          <w:p>
+            <w:pPr>
+              <w:spacing w:before="20" w:after="20" w:line="264" w:lineRule="auto"/>
+            </w:pPr>
+            <w:r>
+              <w:rPr>
+                <w:rFonts w:ascii="Arial" w:hAnsi="Arial" w:eastAsia="Arial"/>
+                <w:b/>
+                <w:i w:val="0"/>
+                <w:color w:val="0A2F5C"/>
+                <w:sz w:val="19"/>
+              </w:rPr>
+              <w:t>1.  DECRETO SUPREMO  N° 171-2026-EF</w:t>
+            </w:r>
+          </w:p>
+        </w:tc>
+      </w:tr>
+      <w:tr>
+        <w:trPr>
+          <w:cantSplit/>
+        </w:trPr>
+        <w:tc>
+          <w:tcPr>
+            <w:tcW w:type="dxa" w:w="2041"/>
+            <w:shd w:val="clear" w:color="auto" w:fill="F2F5FA"/>
+          </w:tcPr>
+          <w:p>
+            <w:pPr>
+              <w:spacing w:before="20" w:after="20" w:line="264" w:lineRule="auto"/>
+            </w:pPr>
+            <w:r>
+              <w:rPr>
+                <w:rFonts w:ascii="Arial" w:hAnsi="Arial" w:eastAsia="Arial"/>
+                <w:b/>
+                <w:i w:val="0"/>
+                <w:color w:val="0A2F5C"/>
+                <w:sz w:val="17"/>
+              </w:rPr>
+              <w:t>Entidad emisora</w:t>
+            </w:r>
+          </w:p>
+        </w:tc>
+        <w:tc>
+          <w:tcPr>
+            <w:tcW w:type="dxa" w:w="7370"/>
+          </w:tcPr>
+          <w:p>
+            <w:pPr>
+              <w:spacing w:before="20" w:after="20" w:line="264" w:lineRule="auto"/>
+            </w:pPr>
+            <w:r>
+              <w:rPr>
+                <w:rFonts w:ascii="Arial" w:hAnsi="Arial" w:eastAsia="Arial"/>
+                <w:b w:val="0"/>
+                <w:i w:val="0"/>
+                <w:sz w:val="18"/>
+              </w:rPr>
+              <w:t>ECONOMÍA Y FINANZAS</w:t>
+            </w:r>
+          </w:p>
+        </w:tc>
+      </w:tr>
+      <w:tr>
+        <w:trPr>
+          <w:cantSplit/>
+        </w:trPr>
+        <w:tc>
+          <w:tcPr>
+            <w:tcW w:type="dxa" w:w="2041"/>
+            <w:shd w:val="clear" w:color="auto" w:fill="F2F5FA"/>
+          </w:tcPr>
+          <w:p>
+            <w:pPr>
+              <w:spacing w:before="20" w:after="20" w:line="264" w:lineRule="auto"/>
+            </w:pPr>
+            <w:r>
+              <w:rPr>
+                <w:rFonts w:ascii="Arial" w:hAnsi="Arial" w:eastAsia="Arial"/>
+                <w:b/>
+                <w:i w:val="0"/>
+                <w:color w:val="0A2F5C"/>
+                <w:sz w:val="17"/>
+              </w:rPr>
+              <w:t>Publicación</w:t>
+            </w:r>
+          </w:p>
+        </w:tc>
+        <w:tc>
+          <w:tcPr>
+            <w:tcW w:type="dxa" w:w="7370"/>
+          </w:tcPr>
+          <w:p>
+            <w:pPr>
+              <w:spacing w:before="20" w:after="20" w:line="264" w:lineRule="auto"/>
+            </w:pPr>
+            <w:r>
+              <w:rPr>
+                <w:rFonts w:ascii="Arial" w:hAnsi="Arial" w:eastAsia="Arial"/>
+                <w:b w:val="0"/>
+                <w:i w:val="0"/>
+                <w:sz w:val="18"/>
+              </w:rPr>
+              <w:t>01/09/2026 · Edición ordinaria</w:t>
+            </w:r>
+          </w:p>
+        </w:tc>
+      </w:tr>
+      <w:tr>
+        <w:trPr>
+          <w:cantSplit/>
+        </w:trPr>
+        <w:tc>
+          <w:tcPr>
+            <w:tcW w:type="dxa" w:w="2041"/>
+            <w:shd w:val="clear" w:color="auto" w:fill="F2F5FA"/>
+          </w:tcPr>
+          <w:p>
+            <w:pPr>
+              <w:spacing w:before="20" w:after="20" w:line="264" w:lineRule="auto"/>
+            </w:pPr>
+            <w:r>
+              <w:rPr>
+                <w:rFonts w:ascii="Arial" w:hAnsi="Arial" w:eastAsia="Arial"/>
+                <w:b/>
+                <w:i w:val="0"/>
+                <w:color w:val="0A2F5C"/>
+                <w:sz w:val="17"/>
+              </w:rPr>
+              <w:t>Temas</w:t>
+            </w:r>
+          </w:p>
+        </w:tc>
+        <w:tc>
+          <w:tcPr>
+            <w:tcW w:type="dxa" w:w="7370"/>
+          </w:tcPr>
+          <w:p>
+            <w:pPr>
+              <w:spacing w:before="20" w:after="20" w:line="264" w:lineRule="auto"/>
+            </w:pPr>
+            <w:r>
+              <w:rPr>
+                <w:rFonts w:ascii="Arial" w:hAnsi="Arial" w:eastAsia="Arial"/>
+                <w:b w:val="0"/>
+                <w:i w:val="0"/>
+                <w:sz w:val="18"/>
+              </w:rPr>
+              <w:t>Normatividad presupuestal</w:t>
+            </w:r>
+          </w:p>
+        </w:tc>
+      </w:tr>
+      <w:tr>
+        <w:trPr>
+          <w:cantSplit/>
+        </w:trPr>
+        <w:tc>
+          <w:tcPr>
+            <w:tcW w:type="dxa" w:w="2041"/>
+            <w:shd w:val="clear" w:color="auto" w:fill="F2F5FA"/>
+          </w:tcPr>
+          <w:p>
+            <w:pPr>
+              <w:spacing w:before="20" w:after="20" w:line="264" w:lineRule="auto"/>
+            </w:pPr>
+            <w:r>
+              <w:rPr>
+                <w:rFonts w:ascii="Arial" w:hAnsi="Arial" w:eastAsia="Arial"/>
+                <w:b/>
+                <w:i w:val="0"/>
+                <w:color w:val="0A2F5C"/>
+                <w:sz w:val="17"/>
+              </w:rPr>
+              <w:t>Sumilla</w:t>
+            </w:r>
+          </w:p>
+        </w:tc>
+        <w:tc>
+          <w:tcPr>
+            <w:tcW w:type="dxa" w:w="7370"/>
+          </w:tcPr>
+          <w:p>
+            <w:pPr>
+              <w:spacing w:before="20" w:after="20" w:line="264" w:lineRule="auto"/>
+            </w:pPr>
+            <w:r>
+              <w:rPr>
+                <w:rFonts w:ascii="Arial" w:hAnsi="Arial" w:eastAsia="Arial"/>
+                <w:b w:val="0"/>
+                <w:i w:val="0"/>
                 <w:sz w:val="18"/>
               </w:rPr>
               <w:t>Decreto Supremo que autoriza Transferencia de Partidas en el Presupuesto del Sector Público para el Año Fiscal 2026 a favor del Ministerio del Interior</w:t>
@@ -287,60 +909,417 @@
         </w:tc>
       </w:tr>
       <w:tr>
+        <w:trPr>
+          <w:cantSplit/>
+        </w:trPr>
         <w:tc>
           <w:tcPr>
-            <w:tcW w:type="dxa" w:w="1247"/>
+            <w:tcW w:type="dxa" w:w="2041"/>
+            <w:shd w:val="clear" w:color="auto" w:fill="F2F5FA"/>
           </w:tcPr>
           <w:p>
+            <w:pPr>
+              <w:spacing w:before="20" w:after="20" w:line="264" w:lineRule="auto"/>
+            </w:pPr>
             <w:r>
               <w:rPr>
-                <w:sz w:val="18"/>
+                <w:rFonts w:ascii="Arial" w:hAnsi="Arial" w:eastAsia="Arial"/>
+                <w:b/>
+                <w:i w:val="0"/>
+                <w:color w:val="0A2F5C"/>
+                <w:sz w:val="17"/>
               </w:rPr>
-              <w:t>01/09/2026</w:t>
+              <w:t>Disposición principal</w:t>
             </w:r>
           </w:p>
         </w:tc>
         <w:tc>
           <w:tcPr>
-            <w:tcW w:type="dxa" w:w="1984"/>
+            <w:tcW w:type="dxa" w:w="7370"/>
           </w:tcPr>
           <w:p>
+            <w:pPr>
+              <w:spacing w:before="20" w:after="20" w:line="264" w:lineRule="auto"/>
+            </w:pPr>
             <w:r>
               <w:rPr>
+                <w:rFonts w:ascii="Arial" w:hAnsi="Arial" w:eastAsia="Arial"/>
+                <w:b w:val="0"/>
+                <w:i w:val="0"/>
+                <w:sz w:val="18"/>
+              </w:rPr>
+              <w:t>Artículo 1.- Objeto 1.1 Se autoriza una Transferencia de Partidas en el Presupuesto del Sector Público para el Año Fiscal 2026, hasta por la suma de S/ 50 000 000,00 (CINCUENTA MILLONES Y 00/100 SOLES), por la fuente de financiamiento Recursos Ordinarios, con cargo a los recursos de la Reserva de Contingencia del Ministerio de Economía y Finanzas a favor del Ministerio del Interior por el cumplimiento de indicadores y metas de la Transferencia Condicionada al Programa Presupuestal 0030: Reducción de Delitos y Faltas que Afectan la Seguridad Ciudadana correspondientes al primer semestre del 2026, en el marco de lo establecido en los numerales 42.1 y 42.2 del artículo 42 de la Ley Nº 32513,…</w:t>
+            </w:r>
+          </w:p>
+        </w:tc>
+      </w:tr>
+      <w:tr>
+        <w:trPr>
+          <w:cantSplit/>
+        </w:trPr>
+        <w:tc>
+          <w:tcPr>
+            <w:tcW w:type="dxa" w:w="2041"/>
+            <w:shd w:val="clear" w:color="auto" w:fill="F2F5FA"/>
+          </w:tcPr>
+          <w:p>
+            <w:pPr>
+              <w:spacing w:before="20" w:after="20" w:line="264" w:lineRule="auto"/>
+            </w:pPr>
+            <w:r>
+              <w:rPr>
+                <w:rFonts w:ascii="Arial" w:hAnsi="Arial" w:eastAsia="Arial"/>
+                <w:b/>
+                <w:i w:val="0"/>
+                <w:color w:val="0A2F5C"/>
+                <w:sz w:val="17"/>
+              </w:rPr>
+              <w:t>Montos citados</w:t>
+            </w:r>
+          </w:p>
+        </w:tc>
+        <w:tc>
+          <w:tcPr>
+            <w:tcW w:type="dxa" w:w="7370"/>
+          </w:tcPr>
+          <w:p>
+            <w:pPr>
+              <w:spacing w:before="20" w:after="20" w:line="264" w:lineRule="auto"/>
+            </w:pPr>
+            <w:r>
+              <w:rPr>
+                <w:rFonts w:ascii="Arial" w:hAnsi="Arial" w:eastAsia="Arial"/>
+                <w:b w:val="0"/>
+                <w:i w:val="0"/>
+                <w:sz w:val="18"/>
+              </w:rPr>
+              <w:t>S/ 50 000 000,00</w:t>
+            </w:r>
+          </w:p>
+        </w:tc>
+      </w:tr>
+      <w:tr>
+        <w:trPr>
+          <w:cantSplit/>
+        </w:trPr>
+        <w:tc>
+          <w:tcPr>
+            <w:tcW w:type="dxa" w:w="2041"/>
+            <w:shd w:val="clear" w:color="auto" w:fill="F2F5FA"/>
+          </w:tcPr>
+          <w:p>
+            <w:pPr>
+              <w:spacing w:before="20" w:after="20" w:line="264" w:lineRule="auto"/>
+            </w:pPr>
+            <w:r>
+              <w:rPr>
+                <w:rFonts w:ascii="Arial" w:hAnsi="Arial" w:eastAsia="Arial"/>
+                <w:b/>
+                <w:i w:val="0"/>
+                <w:color w:val="0A2F5C"/>
+                <w:sz w:val="17"/>
+              </w:rPr>
+              <w:t>Enlaces</w:t>
+            </w:r>
+          </w:p>
+        </w:tc>
+        <w:tc>
+          <w:tcPr>
+            <w:tcW w:type="dxa" w:w="7370"/>
+          </w:tcPr>
+          <w:p>
+            <w:pPr>
+              <w:spacing w:before="20" w:after="20" w:line="264" w:lineRule="auto"/>
+            </w:pPr>
+            <w:hyperlink r:id="rId11">
+              <w:r>
+                <w:rPr>
+                  <w:rFonts w:ascii="Arial" w:hAnsi="Arial" w:eastAsia="Arial" w:cs="Arial"/>
+                  <w:color w:val="0B5CAD"/>
+                  <w:sz w:val="17"/>
+                  <w:u w:val="single"/>
+                </w:rPr>
+                <w:t xml:space="preserve">Texto completo</w:t>
+              </w:r>
+            </w:hyperlink>
+            <w:r>
+              <w:rPr>
+                <w:rFonts w:ascii="Arial" w:hAnsi="Arial" w:eastAsia="Arial"/>
+                <w:b w:val="0"/>
+                <w:i w:val="0"/>
+                <w:color w:val="5B6880"/>
+                <w:sz w:val="17"/>
+              </w:rPr>
+              <w:t xml:space="preserve">   ·   </w:t>
+            </w:r>
+            <w:hyperlink r:id="rId13">
+              <w:r>
+                <w:rPr>
+                  <w:rFonts w:ascii="Arial" w:hAnsi="Arial" w:eastAsia="Arial" w:cs="Arial"/>
+                  <w:color w:val="0B5CAD"/>
+                  <w:sz w:val="17"/>
+                  <w:u w:val="single"/>
+                </w:rPr>
+                <w:t xml:space="preserve">El Peruano</w:t>
+              </w:r>
+            </w:hyperlink>
+            <w:r>
+              <w:rPr>
+                <w:rFonts w:ascii="Arial" w:hAnsi="Arial" w:eastAsia="Arial"/>
+                <w:b w:val="0"/>
+                <w:i w:val="0"/>
+                <w:color w:val="5B6880"/>
+                <w:sz w:val="17"/>
+              </w:rPr>
+              <w:t xml:space="preserve">   ·   </w:t>
+            </w:r>
+            <w:hyperlink r:id="rId14">
+              <w:r>
+                <w:rPr>
+                  <w:rFonts w:ascii="Arial" w:hAnsi="Arial" w:eastAsia="Arial" w:cs="Arial"/>
+                  <w:color w:val="0B5CAD"/>
+                  <w:sz w:val="17"/>
+                  <w:u w:val="single"/>
+                </w:rPr>
+                <w:t xml:space="preserve">PDF</w:t>
+              </w:r>
+            </w:hyperlink>
+          </w:p>
+        </w:tc>
+      </w:tr>
+    </w:tbl>
+    <w:p>
+      <w:pPr>
+        <w:spacing w:before="0" w:after="120" w:line="276" w:lineRule="auto"/>
+      </w:pPr>
+    </w:p>
+    <w:tbl>
+      <w:tblPr>
+        <w:tblW w:type="auto" w:w="0"/>
+        <w:tblLook w:firstColumn="1" w:firstRow="1" w:lastColumn="0" w:lastRow="0" w:noHBand="0" w:noVBand="1" w:val="04A0"/>
+        <w:tblBorders>
+          <w:top w:val="single" w:sz="4" w:space="0" w:color="C9D2DF"/>
+          <w:left w:val="single" w:sz="4" w:space="0" w:color="C9D2DF"/>
+          <w:bottom w:val="single" w:sz="4" w:space="0" w:color="C9D2DF"/>
+          <w:right w:val="single" w:sz="4" w:space="0" w:color="C9D2DF"/>
+          <w:insideH w:val="single" w:sz="4" w:space="0" w:color="C9D2DF"/>
+          <w:insideV w:val="single" w:sz="4" w:space="0" w:color="C9D2DF"/>
+        </w:tblBorders>
+        <w:tblLayout w:type="fixed"/>
+        <w:tblCellMar>
+          <w:top w:w="50" w:type="dxa"/>
+          <w:bottom w:w="50" w:type="dxa"/>
+          <w:left w:w="100" w:type="dxa"/>
+          <w:right w:w="100" w:type="dxa"/>
+        </w:tblCellMar>
+      </w:tblPr>
+      <w:tblGrid>
+        <w:gridCol w:w="4706"/>
+        <w:gridCol w:w="4706"/>
+      </w:tblGrid>
+      <w:tr>
+        <w:trPr>
+          <w:cantSplit/>
+        </w:trPr>
+        <w:tc>
+          <w:tcPr>
+            <w:tcW w:type="dxa" w:w="7370"/>
+            <w:gridSpan w:val="2"/>
+            <w:shd w:val="clear" w:color="auto" w:fill="E8F0FA"/>
+            <w:tcBorders>
+              <w:left w:val="single" w:sz="30" w:space="0" w:color="EB6834"/>
+            </w:tcBorders>
+          </w:tcPr>
+          <w:p>
+            <w:pPr>
+              <w:spacing w:before="20" w:after="20" w:line="264" w:lineRule="auto"/>
+            </w:pPr>
+            <w:r>
+              <w:rPr>
+                <w:rFonts w:ascii="Arial" w:hAnsi="Arial" w:eastAsia="Arial"/>
+                <w:b/>
+                <w:i w:val="0"/>
+                <w:color w:val="0A2F5C"/>
+                <w:sz w:val="19"/>
+              </w:rPr>
+              <w:t>2.  DECRETO SUPREMO  N° 011-2026-TR</w:t>
+            </w:r>
+          </w:p>
+        </w:tc>
+      </w:tr>
+      <w:tr>
+        <w:trPr>
+          <w:cantSplit/>
+        </w:trPr>
+        <w:tc>
+          <w:tcPr>
+            <w:tcW w:type="dxa" w:w="2041"/>
+            <w:shd w:val="clear" w:color="auto" w:fill="F2F5FA"/>
+          </w:tcPr>
+          <w:p>
+            <w:pPr>
+              <w:spacing w:before="20" w:after="20" w:line="264" w:lineRule="auto"/>
+            </w:pPr>
+            <w:r>
+              <w:rPr>
+                <w:rFonts w:ascii="Arial" w:hAnsi="Arial" w:eastAsia="Arial"/>
+                <w:b/>
+                <w:i w:val="0"/>
+                <w:color w:val="0A2F5C"/>
+                <w:sz w:val="17"/>
+              </w:rPr>
+              <w:t>Entidad emisora</w:t>
+            </w:r>
+          </w:p>
+        </w:tc>
+        <w:tc>
+          <w:tcPr>
+            <w:tcW w:type="dxa" w:w="7370"/>
+          </w:tcPr>
+          <w:p>
+            <w:pPr>
+              <w:spacing w:before="20" w:after="20" w:line="264" w:lineRule="auto"/>
+            </w:pPr>
+            <w:r>
+              <w:rPr>
+                <w:rFonts w:ascii="Arial" w:hAnsi="Arial" w:eastAsia="Arial"/>
+                <w:b w:val="0"/>
+                <w:i w:val="0"/>
                 <w:sz w:val="18"/>
               </w:rPr>
               <w:t>TRABAJO Y PROMOCIÓN DEL EMPLEO</w:t>
             </w:r>
           </w:p>
         </w:tc>
+      </w:tr>
+      <w:tr>
+        <w:trPr>
+          <w:cantSplit/>
+        </w:trPr>
         <w:tc>
           <w:tcPr>
-            <w:tcW w:type="dxa" w:w="2268"/>
+            <w:tcW w:type="dxa" w:w="2041"/>
+            <w:shd w:val="clear" w:color="auto" w:fill="F2F5FA"/>
           </w:tcPr>
           <w:p>
+            <w:pPr>
+              <w:spacing w:before="20" w:after="20" w:line="264" w:lineRule="auto"/>
+            </w:pPr>
             <w:r>
               <w:rPr>
-                <w:sz w:val="18"/>
+                <w:rFonts w:ascii="Arial" w:hAnsi="Arial" w:eastAsia="Arial"/>
+                <w:b/>
+                <w:i w:val="0"/>
+                <w:color w:val="0A2F5C"/>
+                <w:sz w:val="17"/>
               </w:rPr>
+              <w:t>Publicación</w:t>
             </w:r>
-            <w:hyperlink r:id="rId10">
-              <w:r>
-                <w:rPr>
-                  <w:color w:val="0563C1"/>
-                  <w:u w:val="single"/>
-                </w:rPr>
-                <w:t>DECRETO SUPREMO  N° 011-2026-TR</w:t>
-              </w:r>
-            </w:hyperlink>
           </w:p>
         </w:tc>
         <w:tc>
           <w:tcPr>
-            <w:tcW w:type="dxa" w:w="4139"/>
+            <w:tcW w:type="dxa" w:w="7370"/>
           </w:tcPr>
           <w:p>
+            <w:pPr>
+              <w:spacing w:before="20" w:after="20" w:line="264" w:lineRule="auto"/>
+            </w:pPr>
             <w:r>
               <w:rPr>
+                <w:rFonts w:ascii="Arial" w:hAnsi="Arial" w:eastAsia="Arial"/>
+                <w:b w:val="0"/>
+                <w:i w:val="0"/>
+                <w:sz w:val="18"/>
+              </w:rPr>
+              <w:t>01/09/2026 · Edición ordinaria</w:t>
+            </w:r>
+          </w:p>
+        </w:tc>
+      </w:tr>
+      <w:tr>
+        <w:trPr>
+          <w:cantSplit/>
+        </w:trPr>
+        <w:tc>
+          <w:tcPr>
+            <w:tcW w:type="dxa" w:w="2041"/>
+            <w:shd w:val="clear" w:color="auto" w:fill="F2F5FA"/>
+          </w:tcPr>
+          <w:p>
+            <w:pPr>
+              <w:spacing w:before="20" w:after="20" w:line="264" w:lineRule="auto"/>
+            </w:pPr>
+            <w:r>
+              <w:rPr>
+                <w:rFonts w:ascii="Arial" w:hAnsi="Arial" w:eastAsia="Arial"/>
+                <w:b/>
+                <w:i w:val="0"/>
+                <w:color w:val="0A2F5C"/>
+                <w:sz w:val="17"/>
+              </w:rPr>
+              <w:t>Temas</w:t>
+            </w:r>
+          </w:p>
+        </w:tc>
+        <w:tc>
+          <w:tcPr>
+            <w:tcW w:type="dxa" w:w="7370"/>
+          </w:tcPr>
+          <w:p>
+            <w:pPr>
+              <w:spacing w:before="20" w:after="20" w:line="264" w:lineRule="auto"/>
+            </w:pPr>
+            <w:r>
+              <w:rPr>
+                <w:rFonts w:ascii="Arial" w:hAnsi="Arial" w:eastAsia="Arial"/>
+                <w:b w:val="0"/>
+                <w:i w:val="0"/>
+                <w:sz w:val="18"/>
+              </w:rPr>
+              <w:t>Normatividad presupuestal</w:t>
+            </w:r>
+          </w:p>
+        </w:tc>
+      </w:tr>
+      <w:tr>
+        <w:trPr>
+          <w:cantSplit/>
+        </w:trPr>
+        <w:tc>
+          <w:tcPr>
+            <w:tcW w:type="dxa" w:w="2041"/>
+            <w:shd w:val="clear" w:color="auto" w:fill="F2F5FA"/>
+          </w:tcPr>
+          <w:p>
+            <w:pPr>
+              <w:spacing w:before="20" w:after="20" w:line="264" w:lineRule="auto"/>
+            </w:pPr>
+            <w:r>
+              <w:rPr>
+                <w:rFonts w:ascii="Arial" w:hAnsi="Arial" w:eastAsia="Arial"/>
+                <w:b/>
+                <w:i w:val="0"/>
+                <w:color w:val="0A2F5C"/>
+                <w:sz w:val="17"/>
+              </w:rPr>
+              <w:t>Sumilla</w:t>
+            </w:r>
+          </w:p>
+        </w:tc>
+        <w:tc>
+          <w:tcPr>
+            <w:tcW w:type="dxa" w:w="7370"/>
+          </w:tcPr>
+          <w:p>
+            <w:pPr>
+              <w:spacing w:before="20" w:after="20" w:line="264" w:lineRule="auto"/>
+            </w:pPr>
+            <w:r>
+              <w:rPr>
+                <w:rFonts w:ascii="Arial" w:hAnsi="Arial" w:eastAsia="Arial"/>
+                <w:b w:val="0"/>
+                <w:i w:val="0"/>
                 <w:sz w:val="18"/>
               </w:rPr>
               <w:t>Decreto Supremo que aprueba la Transferencia Financiera del Aporte Total del Programa Llamkasun Perú a favor de organismos ejecutores</w:t>
@@ -348,230 +1327,357 @@
           </w:p>
         </w:tc>
       </w:tr>
+      <w:tr>
+        <w:trPr>
+          <w:cantSplit/>
+        </w:trPr>
+        <w:tc>
+          <w:tcPr>
+            <w:tcW w:type="dxa" w:w="2041"/>
+            <w:shd w:val="clear" w:color="auto" w:fill="F2F5FA"/>
+          </w:tcPr>
+          <w:p>
+            <w:pPr>
+              <w:spacing w:before="20" w:after="20" w:line="264" w:lineRule="auto"/>
+            </w:pPr>
+            <w:r>
+              <w:rPr>
+                <w:rFonts w:ascii="Arial" w:hAnsi="Arial" w:eastAsia="Arial"/>
+                <w:b/>
+                <w:i w:val="0"/>
+                <w:color w:val="0A2F5C"/>
+                <w:sz w:val="17"/>
+              </w:rPr>
+              <w:t>Disposición principal</w:t>
+            </w:r>
+          </w:p>
+        </w:tc>
+        <w:tc>
+          <w:tcPr>
+            <w:tcW w:type="dxa" w:w="7370"/>
+          </w:tcPr>
+          <w:p>
+            <w:pPr>
+              <w:spacing w:before="20" w:after="20" w:line="264" w:lineRule="auto"/>
+            </w:pPr>
+            <w:r>
+              <w:rPr>
+                <w:rFonts w:ascii="Arial" w:hAnsi="Arial" w:eastAsia="Arial"/>
+                <w:b w:val="0"/>
+                <w:i w:val="0"/>
+                <w:sz w:val="18"/>
+              </w:rPr>
+              <w:t>Artículo 1.- Objeto Autorizar la transferencia financiera del Programa de Empleo Temporal “Llamkasun Perú” a favor de los organismos ejecutores del sector público con quienes se han suscrito 214 (Doscientos catorce) convenios con el objeto de financiar la ejecución de actividades de intervención inmediata (AII-91), en el marco de los distritos comprendidos en el ámbito de la Focalización Geográfica del Programa de Empleo Temporal “Llamkasun Perú” 2026-I (Segundo Grupo); por el importe total de S/ 38 340 508,00 (Treinta y Ocho Millones Trescientos Cuarenta Mil Quinientos Ocho y 00/100 soles), conforme al Anexo que forma parte integrante del presente Decreto Supremo. Artículo 2.-…</w:t>
+            </w:r>
+          </w:p>
+        </w:tc>
+      </w:tr>
+      <w:tr>
+        <w:trPr>
+          <w:cantSplit/>
+        </w:trPr>
+        <w:tc>
+          <w:tcPr>
+            <w:tcW w:type="dxa" w:w="2041"/>
+            <w:shd w:val="clear" w:color="auto" w:fill="F2F5FA"/>
+          </w:tcPr>
+          <w:p>
+            <w:pPr>
+              <w:spacing w:before="20" w:after="20" w:line="264" w:lineRule="auto"/>
+            </w:pPr>
+            <w:r>
+              <w:rPr>
+                <w:rFonts w:ascii="Arial" w:hAnsi="Arial" w:eastAsia="Arial"/>
+                <w:b/>
+                <w:i w:val="0"/>
+                <w:color w:val="0A2F5C"/>
+                <w:sz w:val="17"/>
+              </w:rPr>
+              <w:t>Montos citados</w:t>
+            </w:r>
+          </w:p>
+        </w:tc>
+        <w:tc>
+          <w:tcPr>
+            <w:tcW w:type="dxa" w:w="7370"/>
+          </w:tcPr>
+          <w:p>
+            <w:pPr>
+              <w:spacing w:before="20" w:after="20" w:line="264" w:lineRule="auto"/>
+            </w:pPr>
+            <w:r>
+              <w:rPr>
+                <w:rFonts w:ascii="Arial" w:hAnsi="Arial" w:eastAsia="Arial"/>
+                <w:b w:val="0"/>
+                <w:i w:val="0"/>
+                <w:sz w:val="18"/>
+              </w:rPr>
+              <w:t>S/ 38 340 508,00</w:t>
+            </w:r>
+          </w:p>
+        </w:tc>
+      </w:tr>
+      <w:tr>
+        <w:trPr>
+          <w:cantSplit/>
+        </w:trPr>
+        <w:tc>
+          <w:tcPr>
+            <w:tcW w:type="dxa" w:w="2041"/>
+            <w:shd w:val="clear" w:color="auto" w:fill="F2F5FA"/>
+          </w:tcPr>
+          <w:p>
+            <w:pPr>
+              <w:spacing w:before="20" w:after="20" w:line="264" w:lineRule="auto"/>
+            </w:pPr>
+            <w:r>
+              <w:rPr>
+                <w:rFonts w:ascii="Arial" w:hAnsi="Arial" w:eastAsia="Arial"/>
+                <w:b/>
+                <w:i w:val="0"/>
+                <w:color w:val="0A2F5C"/>
+                <w:sz w:val="17"/>
+              </w:rPr>
+              <w:t>Enlaces</w:t>
+            </w:r>
+          </w:p>
+        </w:tc>
+        <w:tc>
+          <w:tcPr>
+            <w:tcW w:type="dxa" w:w="7370"/>
+          </w:tcPr>
+          <w:p>
+            <w:pPr>
+              <w:spacing w:before="20" w:after="20" w:line="264" w:lineRule="auto"/>
+            </w:pPr>
+            <w:hyperlink r:id="rId12">
+              <w:r>
+                <w:rPr>
+                  <w:rFonts w:ascii="Arial" w:hAnsi="Arial" w:eastAsia="Arial" w:cs="Arial"/>
+                  <w:color w:val="0B5CAD"/>
+                  <w:sz w:val="17"/>
+                  <w:u w:val="single"/>
+                </w:rPr>
+                <w:t xml:space="preserve">Texto completo</w:t>
+              </w:r>
+            </w:hyperlink>
+            <w:r>
+              <w:rPr>
+                <w:rFonts w:ascii="Arial" w:hAnsi="Arial" w:eastAsia="Arial"/>
+                <w:b w:val="0"/>
+                <w:i w:val="0"/>
+                <w:color w:val="5B6880"/>
+                <w:sz w:val="17"/>
+              </w:rPr>
+              <w:t xml:space="preserve">   ·   </w:t>
+            </w:r>
+            <w:hyperlink r:id="rId15">
+              <w:r>
+                <w:rPr>
+                  <w:rFonts w:ascii="Arial" w:hAnsi="Arial" w:eastAsia="Arial" w:cs="Arial"/>
+                  <w:color w:val="0B5CAD"/>
+                  <w:sz w:val="17"/>
+                  <w:u w:val="single"/>
+                </w:rPr>
+                <w:t xml:space="preserve">El Peruano</w:t>
+              </w:r>
+            </w:hyperlink>
+            <w:r>
+              <w:rPr>
+                <w:rFonts w:ascii="Arial" w:hAnsi="Arial" w:eastAsia="Arial"/>
+                <w:b w:val="0"/>
+                <w:i w:val="0"/>
+                <w:color w:val="5B6880"/>
+                <w:sz w:val="17"/>
+              </w:rPr>
+              <w:t xml:space="preserve">   ·   </w:t>
+            </w:r>
+            <w:hyperlink r:id="rId16">
+              <w:r>
+                <w:rPr>
+                  <w:rFonts w:ascii="Arial" w:hAnsi="Arial" w:eastAsia="Arial" w:cs="Arial"/>
+                  <w:color w:val="0B5CAD"/>
+                  <w:sz w:val="17"/>
+                  <w:u w:val="single"/>
+                </w:rPr>
+                <w:t xml:space="preserve">PDF</w:t>
+              </w:r>
+            </w:hyperlink>
+          </w:p>
+        </w:tc>
+      </w:tr>
     </w:tbl>
-    <w:p/>
     <w:p>
       <w:pPr>
-        <w:pStyle w:val="Heading3"/>
+        <w:spacing w:before="0" w:after="120" w:line="276" w:lineRule="auto"/>
+      </w:pPr>
+    </w:p>
+    <w:p>
+      <w:pPr>
+        <w:spacing w:before="200" w:after="0" w:line="276" w:lineRule="auto"/>
+        <w:jc w:val="both"/>
+        <w:pBdr>
+          <w:top w:val="single" w:sz="4" w:space="4" w:color="C9D2DF"/>
+        </w:pBdr>
       </w:pPr>
       <w:r>
-        <w:t>DECRETO SUPREMO  N° 171-2026-EF</w:t>
-      </w:r>
-    </w:p>
-    <w:p>
-      <w:r>
         <w:rPr>
+          <w:rFonts w:ascii="Arial" w:hAnsi="Arial" w:eastAsia="Arial"/>
           <w:b/>
+          <w:i w:val="0"/>
+          <w:color w:val="5B6880"/>
+          <w:sz w:val="15"/>
         </w:rPr>
-        <w:t xml:space="preserve">Entidad: </w:t>
-      </w:r>
-      <w:r>
-        <w:t xml:space="preserve">ECONOMÍA Y FINANZAS   </w:t>
+        <w:t xml:space="preserve">Nota metodológica: </w:t>
       </w:r>
       <w:r>
         <w:rPr>
-          <w:b/>
+          <w:rFonts w:ascii="Arial" w:hAnsi="Arial" w:eastAsia="Arial"/>
+          <w:b w:val="0"/>
+          <w:i w:val="0"/>
+          <w:color w:val="5B6880"/>
+          <w:sz w:val="15"/>
         </w:rPr>
-        <w:t xml:space="preserve">Fecha: </w:t>
+        <w:t xml:space="preserve">se revisan todas las normas publicadas en el Diario Oficial El Peruano en el periodo. Una norma se selecciona cuando su entidad, título o sumilla contiene alguno de los términos definidos para cada tema, o cuando su texto completo menciona a la ATU. Los criterios pueden consultarse y editarse en el panel: </w:t>
       </w:r>
-      <w:r>
-        <w:t>01/09/2026</w:t>
-      </w:r>
-    </w:p>
-    <w:p>
-      <w:r>
-        <w:rPr>
-          <w:b/>
-        </w:rPr>
-        <w:t xml:space="preserve">Temas: </w:t>
-      </w:r>
-      <w:r>
-        <w:t>Normatividad presupuestal</w:t>
-      </w:r>
-    </w:p>
-    <w:p>
-      <w:r>
-        <w:rPr>
-          <w:b/>
-        </w:rPr>
-        <w:t xml:space="preserve">Sumilla: </w:t>
-      </w:r>
-      <w:r>
-        <w:t>Decreto Supremo que autoriza Transferencia de Partidas en el Presupuesto del Sector Público para el Año Fiscal 2026 a favor del Ministerio del Interior</w:t>
-      </w:r>
-    </w:p>
-    <w:p>
-      <w:r>
-        <w:rPr>
-          <w:b/>
-        </w:rPr>
-        <w:t xml:space="preserve">Dispone: </w:t>
-      </w:r>
-      <w:r>
-        <w:t>Artículo 1.- Objeto 1.1 Se autoriza una Transferencia de Partidas en el Presupuesto del Sector Público para el Año Fiscal 2026, hasta por la suma de S/ 50 000 000,00 (CINCUENTA MILLONES Y 00/100 SOLES), por la fuente de financiamiento Recursos Ordinarios, con cargo a los recursos de la Reserva de Contingencia del Ministerio de Economía y Finanzas a favor del Ministerio del Interior por el cumplimiento de indicadores y metas de la Transferencia Condicionada al Programa Presupuestal 0030: Reducción de Delitos y Faltas que Afectan la Seguridad Ciudadana correspondientes al primer semestre del 2026, en el marco de lo establecido en los numerales 42.1 y 42.2 del artículo 42 de la Ley Nº 32513,…</w:t>
-      </w:r>
-    </w:p>
-    <w:p>
-      <w:r>
-        <w:rPr>
-          <w:b/>
-        </w:rPr>
-        <w:t xml:space="preserve">Montos citados: </w:t>
-      </w:r>
-      <w:r>
-        <w:t>S/ 50</w:t>
-      </w:r>
-    </w:p>
-    <w:p>
-      <w:hyperlink r:id="rId9">
+      <w:hyperlink r:id="rId17">
         <w:r>
           <w:rPr>
-            <w:color w:val="0563C1"/>
+            <w:rFonts w:ascii="Arial" w:hAnsi="Arial" w:eastAsia="Arial" w:cs="Arial"/>
+            <w:color w:val="0B5CAD"/>
+            <w:sz w:val="15"/>
             <w:u w:val="single"/>
           </w:rPr>
-          <w:t>Ver texto completo</w:t>
-        </w:r>
-      </w:hyperlink>
-      <w:r>
-        <w:t xml:space="preserve">   </w:t>
-      </w:r>
-      <w:hyperlink r:id="rId11">
-        <w:r>
-          <w:rPr>
-            <w:color w:val="0563C1"/>
-            <w:u w:val="single"/>
-          </w:rPr>
-          <w:t>Ver en El Peruano</w:t>
-        </w:r>
-      </w:hyperlink>
-      <w:r>
-        <w:t xml:space="preserve">   </w:t>
-      </w:r>
-      <w:hyperlink r:id="rId12">
-        <w:r>
-          <w:rPr>
-            <w:color w:val="0563C1"/>
-            <w:u w:val="single"/>
-          </w:rPr>
-          <w:t>PDF</w:t>
-        </w:r>
-      </w:hyperlink>
-    </w:p>
-    <w:p>
-      <w:pPr>
-        <w:pStyle w:val="Heading3"/>
-      </w:pPr>
-      <w:r>
-        <w:t>DECRETO SUPREMO  N° 011-2026-TR</w:t>
-      </w:r>
-    </w:p>
-    <w:p>
-      <w:r>
-        <w:rPr>
-          <w:b/>
-        </w:rPr>
-        <w:t xml:space="preserve">Entidad: </w:t>
-      </w:r>
-      <w:r>
-        <w:t xml:space="preserve">TRABAJO Y PROMOCIÓN DEL EMPLEO   </w:t>
-      </w:r>
-      <w:r>
-        <w:rPr>
-          <w:b/>
-        </w:rPr>
-        <w:t xml:space="preserve">Fecha: </w:t>
-      </w:r>
-      <w:r>
-        <w:t>01/09/2026</w:t>
-      </w:r>
-    </w:p>
-    <w:p>
-      <w:r>
-        <w:rPr>
-          <w:b/>
-        </w:rPr>
-        <w:t xml:space="preserve">Temas: </w:t>
-      </w:r>
-      <w:r>
-        <w:t>Normatividad presupuestal</w:t>
-      </w:r>
-    </w:p>
-    <w:p>
-      <w:r>
-        <w:rPr>
-          <w:b/>
-        </w:rPr>
-        <w:t xml:space="preserve">Sumilla: </w:t>
-      </w:r>
-      <w:r>
-        <w:t>Decreto Supremo que aprueba la Transferencia Financiera del Aporte Total del Programa Llamkasun Perú a favor de organismos ejecutores</w:t>
-      </w:r>
-    </w:p>
-    <w:p>
-      <w:r>
-        <w:rPr>
-          <w:b/>
-        </w:rPr>
-        <w:t xml:space="preserve">Dispone: </w:t>
-      </w:r>
-      <w:r>
-        <w:t>Artículo 1.- Objeto Autorizar la transferencia financiera del Programa de Empleo Temporal “Llamkasun Perú” a favor de los organismos ejecutores del sector público con quienes se han suscrito 214 (Doscientos catorce) convenios con el objeto de financiar la ejecución de actividades de intervención inmediata (AII-91), en el marco de los distritos comprendidos en el ámbito de la Focalización Geográfica del Programa de Empleo Temporal “Llamkasun Perú” 2026-I (Segundo Grupo); por el importe total de S/ 38 340 508,00 (Treinta y Ocho Millones Trescientos Cuarenta Mil Quinientos Ocho y 00/100 soles), conforme al Anexo que forma parte integrante del presente Decreto Supremo. Artículo 2.-…</w:t>
-      </w:r>
-    </w:p>
-    <w:p>
-      <w:r>
-        <w:rPr>
-          <w:b/>
-        </w:rPr>
-        <w:t xml:space="preserve">Montos citados: </w:t>
-      </w:r>
-      <w:r>
-        <w:t>S/ 38, S/ 38</w:t>
-      </w:r>
-    </w:p>
-    <w:p>
-      <w:hyperlink r:id="rId10">
-        <w:r>
-          <w:rPr>
-            <w:color w:val="0563C1"/>
-            <w:u w:val="single"/>
-          </w:rPr>
-          <w:t>Ver texto completo</w:t>
-        </w:r>
-      </w:hyperlink>
-      <w:r>
-        <w:t xml:space="preserve">   </w:t>
-      </w:r>
-      <w:hyperlink r:id="rId13">
-        <w:r>
-          <w:rPr>
-            <w:color w:val="0563C1"/>
-            <w:u w:val="single"/>
-          </w:rPr>
-          <w:t>Ver en El Peruano</w:t>
-        </w:r>
-      </w:hyperlink>
-      <w:r>
-        <w:t xml:space="preserve">   </w:t>
-      </w:r>
-      <w:hyperlink r:id="rId14">
-        <w:r>
-          <w:rPr>
-            <w:color w:val="0563C1"/>
-            <w:u w:val="single"/>
-          </w:rPr>
-          <w:t>PDF</w:t>
+          <w:t xml:space="preserve">reneearmasr.github.io/monitor-normas-elperuano</w:t>
         </w:r>
       </w:hyperlink>
     </w:p>
     <w:sectPr>
-      <w:pgSz w:w="12240" w:h="15840"/>
-      <w:pgMar w:top="1440" w:right="1134" w:bottom="1440" w:left="1134" w:header="720" w:footer="720" w:gutter="0"/>
+      <w:headerReference w:type="default" r:id="rId9"/>
+      <w:footerReference w:type="default" r:id="rId10"/>
+      <w:pgSz w:w="11906" w:h="16838"/>
+      <w:pgMar w:top="1361" w:right="1247" w:bottom="1134" w:left="1247" w:header="567" w:footer="567" w:gutter="0"/>
       <w:cols w:space="720"/>
       <w:docGrid w:linePitch="360"/>
     </w:sectPr>
   </w:body>
 </w:document>
+</file>
+
+<file path=word/footer1.xml><?xml version="1.0" encoding="utf-8"?>
+<w:ftr xmlns:m="http://schemas.openxmlformats.org/officeDocument/2006/math" xmlns:mc="http://schemas.openxmlformats.org/markup-compatibility/2006" xmlns:mo="http://schemas.microsoft.com/office/mac/office/2008/main" xmlns:mv="urn:schemas-microsoft-com:mac:vml" xmlns:o="urn:schemas-microsoft-com:office:office" xmlns:r="http://schemas.openxmlformats.org/officeDocument/2006/relationships" xmlns:v="urn:schemas-microsoft-com:vml" xmlns:w10="urn:schemas-microsoft-com:office:word" xmlns:w14="http://schemas.microsoft.com/office/word/2010/wordml" xmlns:w="http://schemas.openxmlformats.org/wordprocessingml/2006/main" xmlns:wne="http://schemas.microsoft.com/office/word/2006/wordml" xmlns:wp14="http://schemas.microsoft.com/office/word/2010/wordprocessingDrawing" xmlns:wp="http://schemas.openxmlformats.org/drawingml/2006/wordprocessingDrawing" xmlns:wpc="http://schemas.microsoft.com/office/word/2010/wordprocessingCanvas" xmlns:wpg="http://schemas.microsoft.com/office/word/2010/wordprocessingGroup" xmlns:wpi="http://schemas.microsoft.com/office/word/2010/wordprocessingInk" xmlns:wps="http://schemas.microsoft.com/office/word/2010/wordprocessingShape" mc:Ignorable="w14 wp14">
+  <w:p>
+    <w:pPr>
+      <w:pStyle w:val="Footer"/>
+      <w:tabs>
+        <w:tab w:pos="4680" w:val="clear"/>
+        <w:tab w:pos="9360" w:val="clear"/>
+        <w:tab w:pos="9411" w:val="right"/>
+      </w:tabs>
+      <w:pBdr>
+        <w:top w:val="single" w:sz="6" w:space="4" w:color="C9D2DF"/>
+      </w:pBdr>
+    </w:pPr>
+    <w:r>
+      <w:rPr>
+        <w:rFonts w:ascii="Arial" w:hAnsi="Arial" w:eastAsia="Arial"/>
+        <w:b w:val="0"/>
+        <w:i w:val="0"/>
+        <w:color w:val="5B6880"/>
+        <w:sz w:val="15"/>
+      </w:rPr>
+      <w:t>Fuente: Diario Oficial El Peruano · Elaboración automática</w:t>
+    </w:r>
+    <w:r>
+      <w:rPr>
+        <w:rFonts w:ascii="Arial" w:hAnsi="Arial" w:eastAsia="Arial"/>
+        <w:b w:val="0"/>
+        <w:i w:val="0"/>
+        <w:color w:val="5B6880"/>
+        <w:sz w:val="15"/>
+      </w:rPr>
+      <w:tab/>
+      <w:t xml:space="preserve">Página </w:t>
+    </w:r>
+    <w:r>
+      <w:rPr>
+        <w:rFonts w:ascii="Arial" w:hAnsi="Arial" w:eastAsia="Arial"/>
+        <w:b w:val="0"/>
+        <w:i w:val="0"/>
+        <w:color w:val="5B6880"/>
+        <w:sz w:val="15"/>
+      </w:rPr>
+      <w:fldChar w:fldCharType="begin"/>
+      <w:instrText xml:space="preserve"> PAGE </w:instrText>
+      <w:fldChar w:fldCharType="separate"/>
+      <w:t>1</w:t>
+      <w:fldChar w:fldCharType="end"/>
+    </w:r>
+    <w:r>
+      <w:rPr>
+        <w:rFonts w:ascii="Arial" w:hAnsi="Arial" w:eastAsia="Arial"/>
+        <w:b w:val="0"/>
+        <w:i w:val="0"/>
+        <w:color w:val="5B6880"/>
+        <w:sz w:val="15"/>
+      </w:rPr>
+      <w:t xml:space="preserve"> de </w:t>
+    </w:r>
+    <w:r>
+      <w:rPr>
+        <w:rFonts w:ascii="Arial" w:hAnsi="Arial" w:eastAsia="Arial"/>
+        <w:b w:val="0"/>
+        <w:i w:val="0"/>
+        <w:color w:val="5B6880"/>
+        <w:sz w:val="15"/>
+      </w:rPr>
+      <w:fldChar w:fldCharType="begin"/>
+      <w:instrText xml:space="preserve"> NUMPAGES </w:instrText>
+      <w:fldChar w:fldCharType="separate"/>
+      <w:t>1</w:t>
+      <w:fldChar w:fldCharType="end"/>
+    </w:r>
+  </w:p>
+</w:ftr>
+</file>
+
+<file path=word/header1.xml><?xml version="1.0" encoding="utf-8"?>
+<w:hdr xmlns:m="http://schemas.openxmlformats.org/officeDocument/2006/math" xmlns:mc="http://schemas.openxmlformats.org/markup-compatibility/2006" xmlns:mo="http://schemas.microsoft.com/office/mac/office/2008/main" xmlns:mv="urn:schemas-microsoft-com:mac:vml" xmlns:o="urn:schemas-microsoft-com:office:office" xmlns:r="http://schemas.openxmlformats.org/officeDocument/2006/relationships" xmlns:v="urn:schemas-microsoft-com:vml" xmlns:w10="urn:schemas-microsoft-com:office:word" xmlns:w14="http://schemas.microsoft.com/office/word/2010/wordml" xmlns:w="http://schemas.openxmlformats.org/wordprocessingml/2006/main" xmlns:wne="http://schemas.microsoft.com/office/word/2006/wordml" xmlns:wp14="http://schemas.microsoft.com/office/word/2010/wordprocessingDrawing" xmlns:wp="http://schemas.openxmlformats.org/drawingml/2006/wordprocessingDrawing" xmlns:wpc="http://schemas.microsoft.com/office/word/2010/wordprocessingCanvas" xmlns:wpg="http://schemas.microsoft.com/office/word/2010/wordprocessingGroup" xmlns:wpi="http://schemas.microsoft.com/office/word/2010/wordprocessingInk" xmlns:wps="http://schemas.microsoft.com/office/word/2010/wordprocessingShape" mc:Ignorable="w14 wp14">
+  <w:p>
+    <w:pPr>
+      <w:pStyle w:val="Header"/>
+      <w:tabs>
+        <w:tab w:pos="4680" w:val="clear"/>
+        <w:tab w:pos="9360" w:val="clear"/>
+        <w:tab w:pos="9411" w:val="right"/>
+      </w:tabs>
+      <w:pBdr>
+        <w:bottom w:val="single" w:sz="8" w:space="4" w:color="0A2F5C"/>
+      </w:pBdr>
+    </w:pPr>
+    <w:r>
+      <w:rPr>
+        <w:rFonts w:ascii="Arial" w:hAnsi="Arial" w:eastAsia="Arial"/>
+        <w:b/>
+        <w:i w:val="0"/>
+        <w:color w:val="0A2F5C"/>
+        <w:sz w:val="15"/>
+      </w:rPr>
+      <w:t>AUTORIDAD DE TRANSPORTE URBANO PARA LIMA Y CALLAO</w:t>
+    </w:r>
+    <w:r>
+      <w:rPr>
+        <w:rFonts w:ascii="Arial" w:hAnsi="Arial" w:eastAsia="Arial"/>
+        <w:b w:val="0"/>
+        <w:i w:val="0"/>
+        <w:color w:val="5B6880"/>
+        <w:sz w:val="15"/>
+      </w:rPr>
+      <w:tab/>
+      <w:t>Monitor de Normas Legales</w:t>
+    </w:r>
+  </w:p>
+</w:hdr>
 </file>
 
 <file path=word/numbering.xml><?xml version="1.0" encoding="utf-8"?>
@@ -938,8 +2044,8 @@
     <w:qFormat/>
     <w:rsid w:val="00FC693F"/>
     <w:rPr>
-      <w:rFonts w:ascii="Calibri" w:hAnsi="Calibri"/>
-      <w:sz w:val="21"/>
+      <w:rFonts w:ascii="Arial" w:hAnsi="Arial" w:eastAsia="Arial"/>
+      <w:sz w:val="20"/>
     </w:rPr>
   </w:style>
   <w:style w:type="paragraph" w:styleId="Header">

</xml_diff>

<commit_message>
Incluye las normas "Publicacion Digital" (municipalidades) que no se estaban leyendo
- Lee tambien article.edicionesoficiales_articulos_dig y toma el codigo de la portada
- Marca "Publicacion digital" en el Word y en el panel
- Terminos de inversiones: participacion/inversion privada, INVERMET
- Historial 01/09-27/10 recargado

Co-Authored-By: Claude Opus 5.5 <noreply@anthropic.com>
</commit_message>
<xml_diff>
--- a/docs/resumenes/Normas_ElPeruano_20260901.docx
+++ b/docs/resumenes/Normas_ElPeruano_20260901.docx
@@ -145,7 +145,7 @@
                 <w:i w:val="0"/>
                 <w:sz w:val="19"/>
               </w:rPr>
-              <w:t>26/10/2026 16:55</w:t>
+              <w:t>27/10/2026 10:57</w:t>
             </w:r>
           </w:p>
         </w:tc>
@@ -187,7 +187,7 @@
                 <w:i w:val="0"/>
                 <w:sz w:val="19"/>
               </w:rPr>
-              <w:t>109</w:t>
+              <w:t>119</w:t>
             </w:r>
           </w:p>
         </w:tc>
@@ -265,7 +265,7 @@
           <w:i w:val="0"/>
           <w:sz w:val="20"/>
         </w:rPr>
-        <w:t>De las 109 normas publicadas en el periodo, 2 resultan de interés institucional: 2 de normatividad presupuestal. No se identificaron normas que involucren a la ATU. El Cuadro 1 presenta la relación completa y la sección 2, el detalle de cada norma.</w:t>
+        <w:t>De las 119 normas publicadas en el periodo, 2 resultan de interés institucional: 2 de normatividad presupuestal. No se identificaron normas que involucren a la ATU. El Cuadro 1 presenta la relación completa y la sección 2, el detalle de cada norma.</w:t>
       </w:r>
     </w:p>
     <w:p>

</xml_diff>